<commit_message>
Maleficio: el cofre es físico; la pizarra acompaña (pista y «¡Se ha abierto!») y ya no enseña el código
Co-Authored-By: Claude Opus 5.5 <noreply@anthropic.com>
</commit_message>
<xml_diff>
--- a/sda/maleficio-ef/SA-El-Maleficio-de-la-Discordia.docx
+++ b/sda/maleficio-ef/SA-El-Maleficio-de-la-Discordia.docx
@@ -4555,7 +4555,7 @@
                 <w:sz w:val="19"/>
                 <w:szCs w:val="19"/>
               </w:rPr>
-              <w:t xml:space="preserve">Carta (pizarra o papel), cofre con candado de 3 dígitos</w:t>
+              <w:t xml:space="preserve">Carta (pizarra o papel), cofre de verdad con candado de 3 dígitos</w:t>
             </w:r>
           </w:p>
         </w:tc>
@@ -15393,7 +15393,7 @@
                 <w:sz w:val="19"/>
                 <w:szCs w:val="19"/>
               </w:rPr>
-              <w:t xml:space="preserve">Carta de Dumbledore, las cuatro pruebas, las palabras y el candado 675 en la pizarra.</w:t>
+              <w:t xml:space="preserve">Carta de Dumbledore, las cuatro pruebas, las palabras y la pista para abrir el cofre de verdad (el candado es físico).</w:t>
             </w:r>
           </w:p>
         </w:tc>

</xml_diff>

<commit_message>
Maleficio: breakout en 2 días en 3ºA y 3ºB, y juego elegido por la clase en las sesiones de 90'
Co-Authored-By: Claude Opus 5.5 <noreply@anthropic.com>
</commit_message>
<xml_diff>
--- a/sda/maleficio-ef/SA-El-Maleficio-de-la-Discordia.docx
+++ b/sda/maleficio-ef/SA-El-Maleficio-de-la-Discordia.docx
@@ -6301,6 +6301,153 @@
                 <w:sz w:val="19"/>
                 <w:szCs w:val="19"/>
               </w:rPr>
+              <w:t xml:space="preserve">Clases de 90 minutos: el juego de la clase</w:t>
+            </w:r>
+          </w:p>
+          <w:p>
+            <w:pPr>
+              <w:spacing w:after="40"/>
+            </w:pPr>
+            <w:r>
+              <w:rPr>
+                <w:rFonts w:ascii="Calibri" w:cs="Calibri" w:eastAsia="Calibri" w:hAnsi="Calibri"/>
+                <w:sz w:val="19"/>
+                <w:szCs w:val="19"/>
+              </w:rPr>
+              <w:t xml:space="preserve">Solo en las clases de 90 minutos (4ºA y 4ºB). La clase propone tres juegos que ya conoce y vota a mano alzada. Antes de jugar, en 3 minutos, ponen en práctica el Pacto de Hogwarts recién escrito: acuerdan cómo jugarlo para que nadie se quede fuera (equipos mixtos, todos tocan, nadie eliminado mucho rato). Se juega con el «Petrificus Totalus» activo. Al acabar: ¿hemos cumplido el Pacto? ¿Qué norma le añadiríamos?</w:t>
+            </w:r>
+          </w:p>
+        </w:tc>
+        <w:tc>
+          <w:tcPr>
+            <w:tcW w:type="pct" w:w="17%"/>
+            <w:tcBorders>
+              <w:top w:val="single" w:color="B8A27A" w:sz="4"/>
+              <w:left w:val="single" w:color="B8A27A" w:sz="4"/>
+              <w:bottom w:val="single" w:color="B8A27A" w:sz="4"/>
+              <w:right w:val="single" w:color="B8A27A" w:sz="4"/>
+            </w:tcBorders>
+            <w:tcMar>
+              <w:top w:type="dxa" w:w="60"/>
+              <w:left w:type="dxa" w:w="90"/>
+              <w:bottom w:type="dxa" w:w="60"/>
+              <w:right w:type="dxa" w:w="90"/>
+            </w:tcMar>
+            <w:vAlign w:val="top"/>
+          </w:tcPr>
+          <w:p>
+            <w:pPr>
+              <w:spacing w:after="40"/>
+            </w:pPr>
+            <w:r>
+              <w:rPr>
+                <w:rFonts w:ascii="Calibri" w:cs="Calibri" w:eastAsia="Calibri" w:hAnsi="Calibri"/>
+                <w:sz w:val="19"/>
+                <w:szCs w:val="19"/>
+              </w:rPr>
+              <w:t xml:space="preserve">Gran grupo · equipos mixtos que hace el maestro</w:t>
+            </w:r>
+          </w:p>
+        </w:tc>
+        <w:tc>
+          <w:tcPr>
+            <w:tcW w:type="pct" w:w="21%"/>
+            <w:tcBorders>
+              <w:top w:val="single" w:color="B8A27A" w:sz="4"/>
+              <w:left w:val="single" w:color="B8A27A" w:sz="4"/>
+              <w:bottom w:val="single" w:color="B8A27A" w:sz="4"/>
+              <w:right w:val="single" w:color="B8A27A" w:sz="4"/>
+            </w:tcBorders>
+            <w:tcMar>
+              <w:top w:type="dxa" w:w="60"/>
+              <w:left w:type="dxa" w:w="90"/>
+              <w:bottom w:type="dxa" w:w="60"/>
+              <w:right w:type="dxa" w:w="90"/>
+            </w:tcMar>
+            <w:vAlign w:val="top"/>
+          </w:tcPr>
+          <w:p>
+            <w:pPr>
+              <w:spacing w:after="40"/>
+            </w:pPr>
+            <w:r>
+              <w:rPr>
+                <w:rFonts w:ascii="Calibri" w:cs="Calibri" w:eastAsia="Calibri" w:hAnsi="Calibri"/>
+                <w:sz w:val="19"/>
+                <w:szCs w:val="19"/>
+              </w:rPr>
+              <w:t xml:space="preserve">El que pida el juego elegido</w:t>
+            </w:r>
+          </w:p>
+        </w:tc>
+        <w:tc>
+          <w:tcPr>
+            <w:tcW w:type="pct" w:w="10%"/>
+            <w:tcBorders>
+              <w:top w:val="single" w:color="B8A27A" w:sz="4"/>
+              <w:left w:val="single" w:color="B8A27A" w:sz="4"/>
+              <w:bottom w:val="single" w:color="B8A27A" w:sz="4"/>
+              <w:right w:val="single" w:color="B8A27A" w:sz="4"/>
+            </w:tcBorders>
+            <w:tcMar>
+              <w:top w:type="dxa" w:w="60"/>
+              <w:left w:type="dxa" w:w="90"/>
+              <w:bottom w:type="dxa" w:w="60"/>
+              <w:right w:type="dxa" w:w="90"/>
+            </w:tcMar>
+            <w:vAlign w:val="top"/>
+          </w:tcPr>
+          <w:p>
+            <w:pPr>
+              <w:spacing w:after="40"/>
+              <w:jc w:val="center"/>
+            </w:pPr>
+            <w:r>
+              <w:rPr>
+                <w:rFonts w:ascii="Calibri" w:cs="Calibri" w:eastAsia="Calibri" w:hAnsi="Calibri"/>
+                <w:sz w:val="19"/>
+                <w:szCs w:val="19"/>
+              </w:rPr>
+              <w:t xml:space="preserve">40'</w:t>
+            </w:r>
+          </w:p>
+        </w:tc>
+      </w:tr>
+      <w:tr>
+        <w:trPr>
+          <w:cantSplit/>
+        </w:trPr>
+        <w:tc>
+          <w:tcPr>
+            <w:tcW w:type="pct" w:w="52%"/>
+            <w:gridSpan w:val="2"/>
+            <w:tcBorders>
+              <w:top w:val="single" w:color="B8A27A" w:sz="4"/>
+              <w:left w:val="single" w:color="B8A27A" w:sz="4"/>
+              <w:bottom w:val="single" w:color="B8A27A" w:sz="4"/>
+              <w:right w:val="single" w:color="B8A27A" w:sz="4"/>
+            </w:tcBorders>
+            <w:shd w:fill="FBF4E2" w:color="auto" w:val="clear"/>
+            <w:tcMar>
+              <w:top w:type="dxa" w:w="60"/>
+              <w:left w:type="dxa" w:w="90"/>
+              <w:bottom w:type="dxa" w:w="60"/>
+              <w:right w:type="dxa" w:w="90"/>
+            </w:tcMar>
+            <w:vAlign w:val="top"/>
+          </w:tcPr>
+          <w:p>
+            <w:pPr>
+              <w:spacing w:after="40"/>
+            </w:pPr>
+            <w:r>
+              <w:rPr>
+                <w:rFonts w:ascii="Calibri" w:cs="Calibri" w:eastAsia="Calibri" w:hAnsi="Calibri"/>
+                <w:b/>
+                <w:bCs/>
+                <w:sz w:val="19"/>
+                <w:szCs w:val="19"/>
+              </w:rPr>
               <w:t xml:space="preserve">Medidor del Maleficio</w:t>
             </w:r>
           </w:p>
@@ -6327,6 +6474,7 @@
               <w:bottom w:val="single" w:color="B8A27A" w:sz="4"/>
               <w:right w:val="single" w:color="B8A27A" w:sz="4"/>
             </w:tcBorders>
+            <w:shd w:fill="FBF4E2" w:color="auto" w:val="clear"/>
             <w:tcMar>
               <w:top w:type="dxa" w:w="60"/>
               <w:left w:type="dxa" w:w="90"/>
@@ -6358,6 +6506,7 @@
               <w:bottom w:val="single" w:color="B8A27A" w:sz="4"/>
               <w:right w:val="single" w:color="B8A27A" w:sz="4"/>
             </w:tcBorders>
+            <w:shd w:fill="FBF4E2" w:color="auto" w:val="clear"/>
             <w:tcMar>
               <w:top w:type="dxa" w:w="60"/>
               <w:left w:type="dxa" w:w="90"/>
@@ -6389,6 +6538,7 @@
               <w:bottom w:val="single" w:color="B8A27A" w:sz="4"/>
               <w:right w:val="single" w:color="B8A27A" w:sz="4"/>
             </w:tcBorders>
+            <w:shd w:fill="FBF4E2" w:color="auto" w:val="clear"/>
             <w:tcMar>
               <w:top w:type="dxa" w:w="60"/>
               <w:left w:type="dxa" w:w="90"/>

</xml_diff>